<commit_message>
Update SDD with technology decision
</commit_message>
<xml_diff>
--- a/docs/SDD/Task Píxel (SDD).docx
+++ b/docs/SDD/Task Píxel (SDD).docx
@@ -3968,21 +3968,7 @@
         <w:rPr>
           <w:rFonts w:ascii="Arial" w:hAnsi="Arial" w:cs="Arial"/>
         </w:rPr>
-        <w:t xml:space="preserve"> </w:t>
-      </w:r>
-      <w:proofErr w:type="gramStart"/>
-      <w:r>
-        <w:rPr>
-          <w:rFonts w:ascii="Arial" w:hAnsi="Arial" w:cs="Arial"/>
-        </w:rPr>
-        <w:t>Responsable</w:t>
-      </w:r>
-      <w:proofErr w:type="gramEnd"/>
-      <w:r>
-        <w:rPr>
-          <w:rFonts w:ascii="Arial" w:hAnsi="Arial" w:cs="Arial"/>
-        </w:rPr>
-        <w:t xml:space="preserve"> del almacenamiento y recuperación de la información.</w:t>
+        <w:t xml:space="preserve"> Responsable del almacenamiento y recuperación de la información.</w:t>
       </w:r>
     </w:p>
     <w:p>
@@ -8902,6 +8888,113 @@
           </w:p>
         </w:tc>
       </w:tr>
+      <w:tr>
+        <w:tc>
+          <w:tcPr>
+            <w:tcW w:w="2942" w:type="dxa"/>
+          </w:tcPr>
+          <w:p>
+            <w:pPr>
+              <w:pStyle w:val="Titulo1-Mine"/>
+              <w:rPr>
+                <w:rFonts w:ascii="Arial" w:hAnsi="Arial" w:cs="Arial"/>
+                <w:sz w:val="24"/>
+                <w:szCs w:val="24"/>
+              </w:rPr>
+            </w:pPr>
+            <w:r>
+              <w:rPr>
+                <w:rFonts w:ascii="Arial" w:hAnsi="Arial" w:cs="Arial"/>
+                <w:sz w:val="24"/>
+                <w:szCs w:val="24"/>
+              </w:rPr>
+              <w:t>0.7</w:t>
+            </w:r>
+          </w:p>
+        </w:tc>
+        <w:tc>
+          <w:tcPr>
+            <w:tcW w:w="2943" w:type="dxa"/>
+          </w:tcPr>
+          <w:p>
+            <w:pPr>
+              <w:pStyle w:val="Titulo1-Mine"/>
+              <w:rPr>
+                <w:rFonts w:ascii="Arial" w:hAnsi="Arial" w:cs="Arial"/>
+                <w:sz w:val="24"/>
+                <w:szCs w:val="24"/>
+              </w:rPr>
+            </w:pPr>
+            <w:r>
+              <w:rPr>
+                <w:rFonts w:ascii="Arial" w:hAnsi="Arial" w:cs="Arial"/>
+                <w:sz w:val="24"/>
+                <w:szCs w:val="24"/>
+              </w:rPr>
+              <w:t>20/08/226</w:t>
+            </w:r>
+          </w:p>
+        </w:tc>
+        <w:tc>
+          <w:tcPr>
+            <w:tcW w:w="2943" w:type="dxa"/>
+          </w:tcPr>
+          <w:p>
+            <w:pPr>
+              <w:pStyle w:val="Titulo1-Mine"/>
+              <w:rPr>
+                <w:rFonts w:ascii="Arial" w:hAnsi="Arial" w:cs="Arial"/>
+                <w:sz w:val="24"/>
+                <w:szCs w:val="24"/>
+              </w:rPr>
+            </w:pPr>
+            <w:r>
+              <w:rPr>
+                <w:rFonts w:ascii="Arial" w:hAnsi="Arial" w:cs="Arial"/>
+                <w:sz w:val="24"/>
+                <w:szCs w:val="24"/>
+              </w:rPr>
+              <w:t xml:space="preserve">Se selecciono </w:t>
+            </w:r>
+            <w:proofErr w:type="spellStart"/>
+            <w:r>
+              <w:rPr>
+                <w:rFonts w:ascii="Arial" w:hAnsi="Arial" w:cs="Arial"/>
+                <w:sz w:val="24"/>
+                <w:szCs w:val="24"/>
+              </w:rPr>
+              <w:t>Fyne</w:t>
+            </w:r>
+            <w:proofErr w:type="spellEnd"/>
+            <w:r>
+              <w:rPr>
+                <w:rFonts w:ascii="Arial" w:hAnsi="Arial" w:cs="Arial"/>
+                <w:sz w:val="24"/>
+                <w:szCs w:val="24"/>
+              </w:rPr>
+              <w:t xml:space="preserve"> como </w:t>
+            </w:r>
+            <w:proofErr w:type="spellStart"/>
+            <w:r>
+              <w:rPr>
+                <w:rFonts w:ascii="Arial" w:hAnsi="Arial" w:cs="Arial"/>
+                <w:sz w:val="24"/>
+                <w:szCs w:val="24"/>
+              </w:rPr>
+              <w:t>framework</w:t>
+            </w:r>
+            <w:proofErr w:type="spellEnd"/>
+            <w:r>
+              <w:rPr>
+                <w:rFonts w:ascii="Arial" w:hAnsi="Arial" w:cs="Arial"/>
+                <w:sz w:val="24"/>
+                <w:szCs w:val="24"/>
+              </w:rPr>
+              <w:t xml:space="preserve"> de GUI</w:t>
+            </w:r>
+          </w:p>
+        </w:tc>
+      </w:tr>
     </w:tbl>
     <w:p>
       <w:pPr>
@@ -9198,6 +9291,72 @@
               <w:t>Recursos gráficos</w:t>
             </w:r>
             <w:bookmarkEnd w:id="63"/>
+          </w:p>
+        </w:tc>
+      </w:tr>
+      <w:tr>
+        <w:tc>
+          <w:tcPr>
+            <w:tcW w:w="4414" w:type="dxa"/>
+          </w:tcPr>
+          <w:p>
+            <w:pPr>
+              <w:pStyle w:val="Titulo1-Mine"/>
+              <w:jc w:val="left"/>
+              <w:rPr>
+                <w:rFonts w:ascii="Arial" w:hAnsi="Arial" w:cs="Arial"/>
+                <w:sz w:val="24"/>
+                <w:szCs w:val="24"/>
+              </w:rPr>
+            </w:pPr>
+            <w:proofErr w:type="spellStart"/>
+            <w:r>
+              <w:rPr>
+                <w:rFonts w:ascii="Arial" w:hAnsi="Arial" w:cs="Arial"/>
+                <w:sz w:val="24"/>
+                <w:szCs w:val="24"/>
+              </w:rPr>
+              <w:t>Fyne</w:t>
+            </w:r>
+            <w:proofErr w:type="spellEnd"/>
+          </w:p>
+        </w:tc>
+        <w:tc>
+          <w:tcPr>
+            <w:tcW w:w="4414" w:type="dxa"/>
+          </w:tcPr>
+          <w:p>
+            <w:pPr>
+              <w:pStyle w:val="Titulo1-Mine"/>
+              <w:jc w:val="left"/>
+              <w:rPr>
+                <w:rFonts w:ascii="Arial" w:hAnsi="Arial" w:cs="Arial"/>
+              </w:rPr>
+            </w:pPr>
+            <w:r>
+              <w:rPr>
+                <w:rFonts w:ascii="Arial" w:hAnsi="Arial" w:cs="Arial"/>
+                <w:sz w:val="24"/>
+                <w:szCs w:val="24"/>
+              </w:rPr>
+              <w:t>Fram</w:t>
+            </w:r>
+            <w:r>
+              <w:rPr>
+                <w:rFonts w:ascii="Arial" w:hAnsi="Arial" w:cs="Arial"/>
+                <w:sz w:val="24"/>
+                <w:szCs w:val="24"/>
+              </w:rPr>
+              <w:t>e</w:t>
+            </w:r>
+            <w:r>
+              <w:rPr>
+                <w:rFonts w:ascii="Arial" w:hAnsi="Arial" w:cs="Arial"/>
+                <w:sz w:val="24"/>
+                <w:szCs w:val="24"/>
+              </w:rPr>
+              <w:t xml:space="preserve">work GUI </w:t>
+            </w:r>
           </w:p>
         </w:tc>
       </w:tr>
@@ -9624,7 +9783,7 @@
         <v:path o:extrusionok="f" gradientshapeok="t" o:connecttype="rect"/>
         <o:lock v:ext="edit" aspectratio="t"/>
       </v:shapetype>
-      <v:shape id="_x0000_i1025" type="#_x0000_t75" style="width:42.8pt;height:38.7pt" o:bullet="t">
+      <v:shape id="_x0000_i1025" type="#_x0000_t75" style="width:42.75pt;height:39pt" o:bullet="t">
         <v:imagedata r:id="rId1" o:title="Triqueta"/>
       </v:shape>
     </w:pict>

</xml_diff>